<commit_message>
Clean up lab 1
</commit_message>
<xml_diff>
--- a/lab_1/questions.docx
+++ b/lab_1/questions.docx
@@ -407,7 +407,21 @@
           <w:rStyle w:val="SubtleEmphasis"/>
           <w:lang w:val="fr-CA"/>
         </w:rPr>
-        <w:t>Qu’elles sont les méthodes pour souder 2 fils ensemble</w:t>
+        <w:t xml:space="preserve">Qu’elles sont les </w:t>
+      </w:r>
+      <w:r>
+        <w:rPr>
+          <w:rStyle w:val="SubtleEmphasis"/>
+          <w:lang w:val="fr-CA"/>
+        </w:rPr>
+        <w:t xml:space="preserve">2 </w:t>
+      </w:r>
+      <w:r>
+        <w:rPr>
+          <w:rStyle w:val="SubtleEmphasis"/>
+          <w:lang w:val="fr-CA"/>
+        </w:rPr>
+        <w:t>méthodes pour souder 2 fils ensemble</w:t>
       </w:r>
       <w:r>
         <w:rPr>

</xml_diff>